<commit_message>
Actualización de los comentarios en las capturas
Actualización de los comentarios en las capturas de las maquinas virtuales
</commit_message>
<xml_diff>
--- a/Documentación MV/MV1_nuevo.docx
+++ b/Documentación MV/MV1_nuevo.docx
@@ -1,6 +1,6 @@
 
 <file path=word/document.xml><?xml version="1.0" encoding="utf-8"?>
-<w:document xmlns:wpc="http://schemas.microsoft.com/office/word/2010/wordprocessingCanvas" xmlns:cx="http://schemas.microsoft.com/office/drawing/2014/chartex" xmlns:cx1="http://schemas.microsoft.com/office/drawing/2015/9/8/chartex" xmlns:cx2="http://schemas.microsoft.com/office/drawing/2015/10/21/chartex" xmlns:cx3="http://schemas.microsoft.com/office/drawing/2016/5/9/chartex" xmlns:cx4="http://schemas.microsoft.com/office/drawing/2016/5/10/chartex" xmlns:cx5="http://schemas.microsoft.com/office/drawing/2016/5/11/chartex" xmlns:cx6="http://schemas.microsoft.com/office/drawing/2016/5/12/chartex" xmlns:cx7="http://schemas.microsoft.com/office/drawing/2016/5/13/chartex" xmlns:cx8="http://schemas.microsoft.com/office/drawing/2016/5/14/chartex" xmlns:mc="http://schemas.openxmlformats.org/markup-compatibility/2006" xmlns:aink="http://schemas.microsoft.com/office/drawing/2016/ink" xmlns:am3d="http://schemas.microsoft.com/office/drawing/2017/model3d" xmlns:o="urn:schemas-microsoft-com:office:office" xmlns:oel="http://schemas.microsoft.com/office/2019/extlst" xmlns:r="http://schemas.openxmlformats.org/officeDocument/2006/relationships" xmlns:m="http://schemas.openxmlformats.org/officeDocument/2006/math" xmlns:v="urn:schemas-microsoft-com:vml" xmlns:wp14="http://schemas.microsoft.com/office/word/2010/wordprocessingDrawing" xmlns:wp="http://schemas.openxmlformats.org/drawingml/2006/wordprocessingDrawing" xmlns:w10="urn:schemas-microsoft-com:office:word" xmlns:w="http://schemas.openxmlformats.org/wordprocessingml/2006/main" xmlns:w14="http://schemas.microsoft.com/office/word/2010/wordml" xmlns:w15="http://schemas.microsoft.com/office/word/2012/wordml" xmlns:w16cex="http://schemas.microsoft.com/office/word/2018/wordml/cex" xmlns:w16cid="http://schemas.microsoft.com/office/word/2016/wordml/cid" xmlns:w16="http://schemas.microsoft.com/office/word/2018/wordml" xmlns:w16du="http://schemas.microsoft.com/office/word/2023/wordml/word16du" xmlns:w16sdtdh="http://schemas.microsoft.com/office/word/2020/wordml/sdtdatahash" xmlns:w16sdtfl="http://schemas.microsoft.com/office/word/2024/wordml/sdtformatlock" xmlns:w16se="http://schemas.microsoft.com/office/word/2015/wordml/symex" xmlns:wpg="http://schemas.microsoft.com/office/word/2010/wordprocessingGroup" xmlns:wpi="http://schemas.microsoft.com/office/word/2010/wordprocessingInk" xmlns:wne="http://schemas.microsoft.com/office/word/2006/wordml" xmlns:wps="http://schemas.microsoft.com/office/word/2010/wordprocessingShape" mc:Ignorable="w14 w15 w16se w16cid w16 w16cex w16sdtdh w16sdtfl w16du wp14">
+<w:document xmlns:wpc="http://schemas.microsoft.com/office/word/2010/wordprocessingCanvas" xmlns:cx="http://schemas.microsoft.com/office/drawing/2014/chartex" xmlns:cx1="http://schemas.microsoft.com/office/drawing/2015/9/8/chartex" xmlns:cx2="http://schemas.microsoft.com/office/drawing/2015/10/21/chartex" xmlns:cx3="http://schemas.microsoft.com/office/drawing/2016/5/9/chartex" xmlns:cx4="http://schemas.microsoft.com/office/drawing/2016/5/10/chartex" xmlns:cx5="http://schemas.microsoft.com/office/drawing/2016/5/11/chartex" xmlns:cx6="http://schemas.microsoft.com/office/drawing/2016/5/12/chartex" xmlns:cx7="http://schemas.microsoft.com/office/drawing/2016/5/13/chartex" xmlns:cx8="http://schemas.microsoft.com/office/drawing/2016/5/14/chartex" xmlns:mc="http://schemas.openxmlformats.org/markup-compatibility/2006" xmlns:aink="http://schemas.microsoft.com/office/drawing/2016/ink" xmlns:am3d="http://schemas.microsoft.com/office/drawing/2017/model3d" xmlns:o="urn:schemas-microsoft-com:office:office" xmlns:oel="http://schemas.microsoft.com/office/2019/extlst" xmlns:r="http://schemas.openxmlformats.org/officeDocument/2006/relationships" xmlns:m="http://schemas.openxmlformats.org/officeDocument/2006/math" xmlns:v="urn:schemas-microsoft-com:vml" xmlns:wp14="http://schemas.microsoft.com/office/word/2010/wordprocessingDrawing" xmlns:wp="http://schemas.openxmlformats.org/drawingml/2006/wordprocessingDrawing" xmlns:w10="urn:schemas-microsoft-com:office:word" xmlns:w="http://schemas.openxmlformats.org/wordprocessingml/2006/main" xmlns:w14="http://schemas.microsoft.com/office/word/2010/wordml" xmlns:w15="http://schemas.microsoft.com/office/word/2012/wordml" xmlns:w16cex="http://schemas.microsoft.com/office/word/2018/wordml/cex" xmlns:w16cid="http://schemas.microsoft.com/office/word/2016/wordml/cid" xmlns:w16="http://schemas.microsoft.com/office/word/2018/wordml" xmlns:w16du="http://schemas.microsoft.com/office/word/2023/wordml/word16du" xmlns:w16sdtdh="http://schemas.microsoft.com/office/word/2020/wordml/sdtdatahash" xmlns:w16sdtfl="http://schemas.microsoft.com/office/word/2024/wordml/sdtformatlock" xmlns:w16se="http://schemas.microsoft.com/office/word/2015/wordml/symex" xmlns:wpg="http://schemas.microsoft.com/office/word/2010/wordprocessingGroup" xmlns:wpi="http://schemas.microsoft.com/office/word/2010/wordprocessingInk" xmlns:wne="http://schemas.microsoft.com/office/word/2006/wordml" xmlns:wps="http://schemas.microsoft.com/office/word/2010/wordprocessingShape" xmlns:a="http://schemas.openxmlformats.org/drawingml/2006/main" xmlns:a16="http://schemas.microsoft.com/office/drawing/2014/main" xmlns:pic="http://schemas.openxmlformats.org/drawingml/2006/picture" xmlns:a14="http://schemas.microsoft.com/office/drawing/2010/main" mc:Ignorable="w14 w15 w16se w16cid w16 w16cex w16sdtdh w16sdtfl w16du wp14">
   <w:body>
     <w:p>
       <w:pPr>
@@ -449,7 +449,6 @@
     <w:p/>
     <w:p>
       <w:r>
-        <w:lastRenderedPageBreak/>
         <w:t xml:space="preserve">Primero debemos añadir </w:t>
       </w:r>
       <w:r>
@@ -738,36 +737,43 @@
     <w:p/>
     <w:p>
       <w:r>
-        <w:lastRenderedPageBreak/>
+        <w:rPr/>
         <w:t xml:space="preserve">Para el </w:t>
       </w:r>
       <w:r>
+        <w:rPr/>
         <w:t xml:space="preserve">tamaño del </w:t>
       </w:r>
       <w:r>
+        <w:rPr/>
         <w:t xml:space="preserve">Disco Duro Virtual </w:t>
       </w:r>
       <w:r>
+        <w:rPr/>
         <w:t xml:space="preserve">usaremos </w:t>
       </w:r>
-      <w:proofErr w:type="gramStart"/>
-      <w:r>
-        <w:t>50GB</w:t>
-      </w:r>
-      <w:proofErr w:type="gramEnd"/>
-      <w:r>
+      <w:r>
+        <w:rPr/>
+        <w:t>50GB,</w:t>
+      </w:r>
+      <w:r>
+        <w:rPr/>
         <w:t xml:space="preserve"> aunque </w:t>
       </w:r>
       <w:r>
+        <w:rPr/>
         <w:t xml:space="preserve">normalmente </w:t>
       </w:r>
       <w:r>
+        <w:rPr/>
         <w:t xml:space="preserve">es recomendable 25GB para </w:t>
       </w:r>
       <w:r>
+        <w:rPr/>
         <w:t>configuraciones más complejas</w:t>
       </w:r>
       <w:r>
+        <w:rPr/>
         <w:t>.</w:t>
       </w:r>
     </w:p>
@@ -828,24 +834,19 @@
     <w:p/>
     <w:p>
       <w:r>
-        <w:t xml:space="preserve">Una vez configurada el inicio de la </w:t>
-      </w:r>
-      <w:r>
-        <w:t>m</w:t>
-      </w:r>
-      <w:r>
+        <w:rPr/>
+        <w:t>Una vez configurada el inicio de la m</w:t>
+      </w:r>
+      <w:r>
+        <w:rPr/>
         <w:t>áquina</w:t>
       </w:r>
       <w:r>
-        <w:t xml:space="preserve"> pulsamos “Siguiente” para </w:t>
-      </w:r>
-      <w:r>
-        <w:t>poder revisar l</w:t>
-      </w:r>
-      <w:r>
-        <w:t>o realizado hasta ahora:</w:t>
-      </w:r>
-    </w:p>
+        <w:rPr/>
+        <w:t xml:space="preserve"> pulsamos “Siguiente” para poder revisar lo realizado hasta ahora:</w:t>
+      </w:r>
+    </w:p>
+    <w:p/>
     <w:p>
       <w:r>
         <w:rPr>
@@ -919,7 +920,6 @@
           <w:sz w:val="32"/>
           <w:szCs w:val="32"/>
         </w:rPr>
-        <w:lastRenderedPageBreak/>
         <w:t>CONFIGURACIÓN DE LOS ADPTADORES</w:t>
       </w:r>
     </w:p>
@@ -975,7 +975,10 @@
         <w:t xml:space="preserve">de RED </w:t>
       </w:r>
       <w:r>
-        <w:sym w:font="Wingdings" w:char="F0E0"/>
+        <w:rPr>
+          <w:rFonts w:ascii="Wingdings" w:hAnsi="Wingdings" w:eastAsia="Wingdings" w:cs="Wingdings"/>
+        </w:rPr>
+        <w:t>à</w:t>
       </w:r>
       <w:r>
         <w:t xml:space="preserve"> </w:t>
@@ -1089,7 +1092,6 @@
           <w:sz w:val="32"/>
           <w:szCs w:val="32"/>
         </w:rPr>
-        <w:lastRenderedPageBreak/>
         <w:t>INI</w:t>
       </w:r>
       <w:r>
@@ -1311,7 +1313,6 @@
     </w:p>
     <w:p>
       <w:r>
-        <w:lastRenderedPageBreak/>
         <w:t xml:space="preserve">En la siguiente ventana nos demuestra la </w:t>
       </w:r>
       <w:r>
@@ -1486,7 +1487,6 @@
         <w:rPr>
           <w:noProof/>
         </w:rPr>
-        <w:lastRenderedPageBreak/>
         <w:t xml:space="preserve">La siguiente ventana demuestra que base queremos instalar, nos interesa la primera opción que </w:t>
       </w:r>
       <w:r>
@@ -1578,24 +1578,34 @@
           <w:sz w:val="28"/>
           <w:szCs w:val="28"/>
         </w:rPr>
-        <w:lastRenderedPageBreak/>
         <w:t>CONFIGURAR IP</w:t>
       </w:r>
     </w:p>
     <w:p>
       <w:r>
+        <w:rPr/>
         <w:t>Cuando se crea una máquina</w:t>
       </w:r>
       <w:r>
-        <w:t xml:space="preserve">, por defecto se aplica una IP que se puede </w:t>
-      </w:r>
-      <w:r>
+        <w:rPr/>
+        <w:t>, por defecto se aplica una IP</w:t>
+      </w:r>
+      <w:r>
+        <w:rPr/>
+        <w:t xml:space="preserve"> que se puede </w:t>
+      </w:r>
+      <w:r>
+        <w:rPr/>
         <w:t xml:space="preserve">ver en la parte DHCPv4, en este caso </w:t>
       </w:r>
       <w:r>
-        <w:sym w:font="Wingdings" w:char="F0E0"/>
-      </w:r>
-      <w:r>
+        <w:rPr>
+          <w:rFonts w:ascii="Wingdings" w:hAnsi="Wingdings" w:eastAsia="Wingdings" w:cs="Wingdings"/>
+        </w:rPr>
+        <w:t>à</w:t>
+      </w:r>
+      <w:r>
+        <w:rPr/>
         <w:t xml:space="preserve"> 10.0.2.15/24</w:t>
       </w:r>
     </w:p>
@@ -1822,7 +1832,6 @@
     </w:p>
     <w:p>
       <w:r>
-        <w:lastRenderedPageBreak/>
         <w:t>En esta ventana se completa por defecto el Mirro Address, simplemente lo ejecutaremos y esperaremos a que se finalice la carga:</w:t>
       </w:r>
     </w:p>
@@ -1961,7 +1970,6 @@
     </w:p>
     <w:p>
       <w:r>
-        <w:lastRenderedPageBreak/>
         <w:t>Aquí tampoco debemos hacer nada, solo revisar:</w:t>
       </w:r>
     </w:p>
@@ -2114,7 +2122,6 @@
           <w:sz w:val="28"/>
           <w:szCs w:val="28"/>
         </w:rPr>
-        <w:lastRenderedPageBreak/>
         <w:t>CONFIRGURACIÓN DE PERFIL</w:t>
       </w:r>
     </w:p>
@@ -2305,7 +2312,6 @@
           <w:sz w:val="28"/>
           <w:szCs w:val="28"/>
         </w:rPr>
-        <w:lastRenderedPageBreak/>
         <w:t>INSTALACIÓN OPENSSH</w:t>
       </w:r>
     </w:p>
@@ -2444,7 +2450,6 @@
     <w:p/>
     <w:p>
       <w:r>
-        <w:lastRenderedPageBreak/>
         <w:t>Con todo configurado e instalado con esta ventana esperaremos a que se descargue todo y ya estaría listo.</w:t>
       </w:r>
     </w:p>
@@ -2536,7 +2541,7 @@
       <w:r>
         <w:t>URL: </w:t>
       </w:r>
-      <w:hyperlink r:id="rId37" w:tgtFrame="_blank" w:history="1">
+      <w:hyperlink w:tgtFrame="_blank" w:history="1" r:id="rId37">
         <w:r>
           <w:rPr>
             <w:rStyle w:val="Hipervnculo"/>
@@ -2572,7 +2577,6 @@
           <w:sz w:val="32"/>
           <w:szCs w:val="32"/>
         </w:rPr>
-        <w:lastRenderedPageBreak/>
         <w:t>DESCARGA MYSQL</w:t>
       </w:r>
     </w:p>
@@ -2598,47 +2602,58 @@
         </w:rPr>
       </w:pPr>
       <w:r>
+        <w:rPr/>
         <w:t xml:space="preserve">Para ésta </w:t>
       </w:r>
       <w:r>
+        <w:rPr/>
         <w:t>MV1 necesitaremos MyS</w:t>
       </w:r>
       <w:r>
+        <w:rPr/>
         <w:t xml:space="preserve">QL </w:t>
       </w:r>
       <w:r>
+        <w:rPr/>
         <w:t xml:space="preserve">con usuario </w:t>
       </w:r>
       <w:r>
         <w:rPr>
-          <w:b/>
-          <w:bCs/>
+          <w:b w:val="1"/>
+          <w:bCs w:val="1"/>
         </w:rPr>
         <w:t>root</w:t>
       </w:r>
     </w:p>
     <w:p>
       <w:r>
-        <w:t xml:space="preserve">Con el siguiente enlace </w:t>
-      </w:r>
-      <w:r>
-        <w:t xml:space="preserve">nos hemos guiado para realizar la instalación de </w:t>
-      </w:r>
-      <w:r>
-        <w:t>MySQL:</w:t>
-      </w:r>
-    </w:p>
-    <w:p>
-      <w:r>
-        <w:rPr>
-          <w:b/>
-          <w:bCs/>
+        <w:rPr/>
+        <w:t>Con el siguiente enlace nos hemos guiado para realizar la instalación de MySQL:</w:t>
+      </w:r>
+    </w:p>
+    <w:p>
+      <w:pPr>
+        <w:pStyle w:val="Normal"/>
+      </w:pPr>
+      <w:r>
+        <w:rPr>
+          <w:b w:val="1"/>
+          <w:bCs w:val="1"/>
         </w:rPr>
         <w:t>URL</w:t>
       </w:r>
       <w:r>
-        <w:t>: https://extassisnetwork.com/tutoriales/como-instalar-mysql-en-ubuntu/</w:t>
-      </w:r>
+        <w:rPr/>
+        <w:t xml:space="preserve">: </w:t>
+      </w:r>
+      <w:hyperlink r:id="Rabaed8037a7f4ef9">
+        <w:r>
+          <w:rPr>
+            <w:rStyle w:val="Hipervnculo"/>
+          </w:rPr>
+          <w:t>https://extassisnetwork.com/tutoriales/como-instalar-mysql-en-ubuntu/</w:t>
+        </w:r>
+      </w:hyperlink>
     </w:p>
     <w:p>
       <w:r>
@@ -2771,7 +2786,6 @@
     <w:p/>
     <w:p>
       <w:r>
-        <w:lastRenderedPageBreak/>
         <w:t xml:space="preserve">Instalada MySQL, automáticamente </w:t>
       </w:r>
       <w:r>
@@ -2916,32 +2930,29 @@
     </w:p>
     <w:p>
       <w:r>
-        <w:rPr>
-          <w:noProof/>
-        </w:rPr>
         <w:drawing>
-          <wp:inline distT="0" distB="0" distL="0" distR="0" wp14:anchorId="71593A88" wp14:editId="42062821">
+          <wp:inline wp14:editId="332E3C1D" wp14:anchorId="71593A88">
             <wp:extent cx="5724525" cy="1495425"/>
             <wp:effectExtent l="0" t="0" r="0" b="0"/>
             <wp:docPr id="952271911" name="drawing">
-              <a:extLst xmlns:a="http://schemas.openxmlformats.org/drawingml/2006/main">
+              <a:extLst>
                 <a:ext uri="{FF2B5EF4-FFF2-40B4-BE49-F238E27FC236}">
                   <a16:creationId xmlns:a16="http://schemas.microsoft.com/office/drawing/2014/main" id="{9B4BD59E-6692-4906-9BB9-785D0100C585}"/>
                 </a:ext>
               </a:extLst>
             </wp:docPr>
             <wp:cNvGraphicFramePr>
-              <a:graphicFrameLocks xmlns:a="http://schemas.openxmlformats.org/drawingml/2006/main" noChangeAspect="1"/>
+              <a:graphicFrameLocks noChangeAspect="1"/>
             </wp:cNvGraphicFramePr>
-            <a:graphic xmlns:a="http://schemas.openxmlformats.org/drawingml/2006/main">
-              <a:graphicData uri="http://schemas.openxmlformats.org/drawingml/2006/picture">
+            <a:graphic>
+              <a:graphicData xmlns:a="http://schemas.openxmlformats.org/drawingml/2006/main" uri="http://schemas.openxmlformats.org/drawingml/2006/picture">
                 <pic:pic xmlns:pic="http://schemas.openxmlformats.org/drawingml/2006/picture">
                   <pic:nvPicPr>
                     <pic:cNvPr id="952271911" name="Picture 952271911"/>
                     <pic:cNvPicPr/>
                   </pic:nvPicPr>
                   <pic:blipFill>
-                    <a:blip r:embed="rId42">
+                    <a:blip xmlns:r="http://schemas.openxmlformats.org/officeDocument/2006/relationships" r:embed="rId42">
                       <a:extLst>
                         <a:ext uri="{28A0092B-C50C-407E-A947-70E740481C1C}">
                           <a14:useLocalDpi xmlns:a14="http://schemas.microsoft.com/office/drawing/2010/main"/>
@@ -2966,6 +2977,16 @@
             </a:graphic>
           </wp:inline>
         </w:drawing>
+      </w:r>
+    </w:p>
+    <w:p>
+      <w:r>
+        <w:rPr/>
+        <w:t xml:space="preserve">Se comprueba que el MySQL este instalado </w:t>
+      </w:r>
+      <w:r>
+        <w:rPr/>
+        <w:t>y se entra en el para comprobarlo.</w:t>
       </w:r>
     </w:p>
     <w:p>
@@ -3023,7 +3044,96 @@
       </w:r>
     </w:p>
     <w:p/>
-    <w:p/>
+    <w:p>
+      <w:r>
+        <w:rPr>
+          <w:b w:val="1"/>
+          <w:bCs w:val="1"/>
+          <w:sz w:val="32"/>
+          <w:szCs w:val="32"/>
+        </w:rPr>
+        <w:t>Configuración del firewall</w:t>
+      </w:r>
+    </w:p>
+    <w:p>
+      <w:r>
+        <w:rPr>
+          <w:b w:val="0"/>
+          <w:bCs w:val="0"/>
+          <w:sz w:val="24"/>
+          <w:szCs w:val="24"/>
+        </w:rPr>
+        <w:t xml:space="preserve">En el caso de la MV1 se pide que solo se pueda acceder a ella a través de la MV2 y las IP de </w:t>
+      </w:r>
+      <w:r>
+        <w:rPr>
+          <w:b w:val="0"/>
+          <w:bCs w:val="0"/>
+          <w:sz w:val="24"/>
+          <w:szCs w:val="24"/>
+        </w:rPr>
+        <w:t>laboratorio</w:t>
+      </w:r>
+      <w:r>
+        <w:rPr>
+          <w:b w:val="0"/>
+          <w:bCs w:val="0"/>
+          <w:sz w:val="24"/>
+          <w:szCs w:val="24"/>
+        </w:rPr>
+        <w:t>.</w:t>
+      </w:r>
+    </w:p>
+    <w:p>
+      <w:r>
+        <w:rPr>
+          <w:b w:val="0"/>
+          <w:bCs w:val="0"/>
+          <w:sz w:val="24"/>
+          <w:szCs w:val="24"/>
+        </w:rPr>
+        <w:t xml:space="preserve">Por ello se muestra a continuación como se permite una IP en </w:t>
+      </w:r>
+      <w:r>
+        <w:rPr>
+          <w:b w:val="0"/>
+          <w:bCs w:val="0"/>
+          <w:sz w:val="24"/>
+          <w:szCs w:val="24"/>
+        </w:rPr>
+        <w:t>específico</w:t>
+      </w:r>
+      <w:r>
+        <w:rPr>
+          <w:b w:val="0"/>
+          <w:bCs w:val="0"/>
+          <w:sz w:val="24"/>
+          <w:szCs w:val="24"/>
+        </w:rPr>
+        <w:t>.</w:t>
+      </w:r>
+    </w:p>
+    <w:p>
+      <w:r>
+        <w:rPr>
+          <w:b w:val="0"/>
+          <w:bCs w:val="0"/>
+          <w:sz w:val="24"/>
+          <w:szCs w:val="24"/>
+        </w:rPr>
+        <w:t>Después se comprueba que se ha hecho correctamente</w:t>
+      </w:r>
+    </w:p>
+    <w:p>
+      <w:pPr>
+        <w:rPr>
+          <w:b w:val="0"/>
+          <w:bCs w:val="0"/>
+          <w:sz w:val="24"/>
+          <w:szCs w:val="24"/>
+        </w:rPr>
+      </w:pPr>
+    </w:p>
     <w:p>
       <w:r>
         <w:rPr>
@@ -3074,7 +3184,12 @@
     </w:p>
     <w:p/>
     <w:p/>
-    <w:p/>
+    <w:p>
+      <w:r>
+        <w:rPr/>
+        <w:t>Ahora se demuestra cómo se hace con la IP de laboratorio y al igual que el caso anterior se comprueba que se hizo correctamente.</w:t>
+      </w:r>
+    </w:p>
     <w:p/>
     <w:p>
       <w:r>
@@ -3127,7 +3242,7 @@
     <w:sectPr>
       <w:headerReference w:type="default" r:id="rId46"/>
       <w:footerReference w:type="default" r:id="rId47"/>
-      <w:pgSz w:w="11906" w:h="16838"/>
+      <w:pgSz w:w="11906" w:h="16838" w:orient="portrait"/>
       <w:pgMar w:top="1440" w:right="1440" w:bottom="1440" w:left="1440" w:header="720" w:footer="720" w:gutter="0"/>
       <w:cols w:space="720"/>
       <w:docGrid w:linePitch="360"/>
@@ -3330,7 +3445,7 @@
         <w:ind w:left="720" w:hanging="360"/>
       </w:pPr>
       <w:rPr>
-        <w:rFonts w:ascii="Symbol" w:hAnsi="Symbol" w:hint="default"/>
+        <w:rFonts w:hint="default" w:ascii="Symbol" w:hAnsi="Symbol"/>
       </w:rPr>
     </w:lvl>
     <w:lvl w:ilvl="1" w:tplc="0C0A0003" w:tentative="1">
@@ -3342,7 +3457,7 @@
         <w:ind w:left="1440" w:hanging="360"/>
       </w:pPr>
       <w:rPr>
-        <w:rFonts w:ascii="Courier New" w:hAnsi="Courier New" w:cs="Courier New" w:hint="default"/>
+        <w:rFonts w:hint="default" w:ascii="Courier New" w:hAnsi="Courier New" w:cs="Courier New"/>
       </w:rPr>
     </w:lvl>
     <w:lvl w:ilvl="2" w:tplc="0C0A0005" w:tentative="1">
@@ -3354,7 +3469,7 @@
         <w:ind w:left="2160" w:hanging="360"/>
       </w:pPr>
       <w:rPr>
-        <w:rFonts w:ascii="Wingdings" w:hAnsi="Wingdings" w:hint="default"/>
+        <w:rFonts w:hint="default" w:ascii="Wingdings" w:hAnsi="Wingdings"/>
       </w:rPr>
     </w:lvl>
     <w:lvl w:ilvl="3" w:tplc="0C0A0001" w:tentative="1">
@@ -3366,7 +3481,7 @@
         <w:ind w:left="2880" w:hanging="360"/>
       </w:pPr>
       <w:rPr>
-        <w:rFonts w:ascii="Symbol" w:hAnsi="Symbol" w:hint="default"/>
+        <w:rFonts w:hint="default" w:ascii="Symbol" w:hAnsi="Symbol"/>
       </w:rPr>
     </w:lvl>
     <w:lvl w:ilvl="4" w:tplc="0C0A0003" w:tentative="1">
@@ -3378,7 +3493,7 @@
         <w:ind w:left="3600" w:hanging="360"/>
       </w:pPr>
       <w:rPr>
-        <w:rFonts w:ascii="Courier New" w:hAnsi="Courier New" w:cs="Courier New" w:hint="default"/>
+        <w:rFonts w:hint="default" w:ascii="Courier New" w:hAnsi="Courier New" w:cs="Courier New"/>
       </w:rPr>
     </w:lvl>
     <w:lvl w:ilvl="5" w:tplc="0C0A0005" w:tentative="1">
@@ -3390,7 +3505,7 @@
         <w:ind w:left="4320" w:hanging="360"/>
       </w:pPr>
       <w:rPr>
-        <w:rFonts w:ascii="Wingdings" w:hAnsi="Wingdings" w:hint="default"/>
+        <w:rFonts w:hint="default" w:ascii="Wingdings" w:hAnsi="Wingdings"/>
       </w:rPr>
     </w:lvl>
     <w:lvl w:ilvl="6" w:tplc="0C0A0001" w:tentative="1">
@@ -3402,7 +3517,7 @@
         <w:ind w:left="5040" w:hanging="360"/>
       </w:pPr>
       <w:rPr>
-        <w:rFonts w:ascii="Symbol" w:hAnsi="Symbol" w:hint="default"/>
+        <w:rFonts w:hint="default" w:ascii="Symbol" w:hAnsi="Symbol"/>
       </w:rPr>
     </w:lvl>
     <w:lvl w:ilvl="7" w:tplc="0C0A0003" w:tentative="1">
@@ -3414,7 +3529,7 @@
         <w:ind w:left="5760" w:hanging="360"/>
       </w:pPr>
       <w:rPr>
-        <w:rFonts w:ascii="Courier New" w:hAnsi="Courier New" w:cs="Courier New" w:hint="default"/>
+        <w:rFonts w:hint="default" w:ascii="Courier New" w:hAnsi="Courier New" w:cs="Courier New"/>
       </w:rPr>
     </w:lvl>
     <w:lvl w:ilvl="8" w:tplc="0C0A0005" w:tentative="1">
@@ -3426,7 +3541,7 @@
         <w:ind w:left="6480" w:hanging="360"/>
       </w:pPr>
       <w:rPr>
-        <w:rFonts w:ascii="Wingdings" w:hAnsi="Wingdings" w:hint="default"/>
+        <w:rFonts w:hint="default" w:ascii="Wingdings" w:hAnsi="Wingdings"/>
       </w:rPr>
     </w:lvl>
   </w:abstractNum>
@@ -3437,11 +3552,11 @@
 </file>
 
 <file path=word/styles.xml><?xml version="1.0" encoding="utf-8"?>
-<w:styles xmlns:mc="http://schemas.openxmlformats.org/markup-compatibility/2006" xmlns:r="http://schemas.openxmlformats.org/officeDocument/2006/relationships" xmlns:w="http://schemas.openxmlformats.org/wordprocessingml/2006/main" xmlns:w14="http://schemas.microsoft.com/office/word/2010/wordml" xmlns:w15="http://schemas.microsoft.com/office/word/2012/wordml" xmlns:w16cex="http://schemas.microsoft.com/office/word/2018/wordml/cex" xmlns:w16cid="http://schemas.microsoft.com/office/word/2016/wordml/cid" xmlns:w16="http://schemas.microsoft.com/office/word/2018/wordml" xmlns:w16du="http://schemas.microsoft.com/office/word/2023/wordml/word16du" xmlns:w16sdtdh="http://schemas.microsoft.com/office/word/2020/wordml/sdtdatahash" xmlns:w16sdtfl="http://schemas.microsoft.com/office/word/2024/wordml/sdtformatlock" xmlns:w16se="http://schemas.microsoft.com/office/word/2015/wordml/symex" mc:Ignorable="w14 w15 w16se w16cid w16 w16cex w16sdtdh w16sdtfl w16du">
+<w:styles xmlns:wp14="http://schemas.microsoft.com/office/word/2010/wordprocessingDrawing" xmlns:mc="http://schemas.openxmlformats.org/markup-compatibility/2006" xmlns:r="http://schemas.openxmlformats.org/officeDocument/2006/relationships" xmlns:w="http://schemas.openxmlformats.org/wordprocessingml/2006/main" xmlns:w14="http://schemas.microsoft.com/office/word/2010/wordml" xmlns:w15="http://schemas.microsoft.com/office/word/2012/wordml" xmlns:w16cex="http://schemas.microsoft.com/office/word/2018/wordml/cex" xmlns:w16cid="http://schemas.microsoft.com/office/word/2016/wordml/cid" xmlns:w16="http://schemas.microsoft.com/office/word/2018/wordml" xmlns:w16du="http://schemas.microsoft.com/office/word/2023/wordml/word16du" xmlns:w16sdtdh="http://schemas.microsoft.com/office/word/2020/wordml/sdtdatahash" xmlns:w16sdtfl="http://schemas.microsoft.com/office/word/2024/wordml/sdtformatlock" xmlns:w16se="http://schemas.microsoft.com/office/word/2015/wordml/symex" mc:Ignorable="w14 w15 w16se w16cid w16 w16cex w16sdtdh w16sdtfl w16du wp14">
   <w:docDefaults>
     <w:rPrDefault>
       <w:rPr>
-        <w:rFonts w:asciiTheme="minorHAnsi" w:eastAsiaTheme="minorHAnsi" w:hAnsiTheme="minorHAnsi" w:cstheme="minorBidi"/>
+        <w:rFonts w:asciiTheme="minorHAnsi" w:hAnsiTheme="minorHAnsi" w:eastAsiaTheme="minorHAnsi" w:cstheme="minorBidi"/>
         <w:sz w:val="24"/>
         <w:szCs w:val="24"/>
         <w:lang w:val="es-ES" w:eastAsia="en-US" w:bidi="ar-SA"/>
@@ -3456,14 +3571,14 @@
   <w:latentStyles w:defLockedState="0" w:defUIPriority="99" w:defSemiHidden="0" w:defUnhideWhenUsed="0" w:defQFormat="0" w:count="376">
     <w:lsdException w:name="Normal" w:uiPriority="0" w:qFormat="1"/>
     <w:lsdException w:name="heading 1" w:uiPriority="9" w:qFormat="1"/>
-    <w:lsdException w:name="heading 2" w:semiHidden="1" w:uiPriority="9" w:unhideWhenUsed="1" w:qFormat="1"/>
-    <w:lsdException w:name="heading 3" w:semiHidden="1" w:uiPriority="9" w:unhideWhenUsed="1" w:qFormat="1"/>
-    <w:lsdException w:name="heading 4" w:semiHidden="1" w:uiPriority="9" w:unhideWhenUsed="1" w:qFormat="1"/>
-    <w:lsdException w:name="heading 5" w:semiHidden="1" w:uiPriority="9" w:unhideWhenUsed="1" w:qFormat="1"/>
-    <w:lsdException w:name="heading 6" w:semiHidden="1" w:uiPriority="9" w:unhideWhenUsed="1" w:qFormat="1"/>
-    <w:lsdException w:name="heading 7" w:semiHidden="1" w:uiPriority="9" w:unhideWhenUsed="1" w:qFormat="1"/>
-    <w:lsdException w:name="heading 8" w:semiHidden="1" w:uiPriority="9" w:unhideWhenUsed="1" w:qFormat="1"/>
-    <w:lsdException w:name="heading 9" w:semiHidden="1" w:uiPriority="9" w:unhideWhenUsed="1" w:qFormat="1"/>
+    <w:lsdException w:name="heading 2" w:uiPriority="9" w:semiHidden="1" w:unhideWhenUsed="1" w:qFormat="1"/>
+    <w:lsdException w:name="heading 3" w:uiPriority="9" w:semiHidden="1" w:unhideWhenUsed="1" w:qFormat="1"/>
+    <w:lsdException w:name="heading 4" w:uiPriority="9" w:semiHidden="1" w:unhideWhenUsed="1" w:qFormat="1"/>
+    <w:lsdException w:name="heading 5" w:uiPriority="9" w:semiHidden="1" w:unhideWhenUsed="1" w:qFormat="1"/>
+    <w:lsdException w:name="heading 6" w:uiPriority="9" w:semiHidden="1" w:unhideWhenUsed="1" w:qFormat="1"/>
+    <w:lsdException w:name="heading 7" w:uiPriority="9" w:semiHidden="1" w:unhideWhenUsed="1" w:qFormat="1"/>
+    <w:lsdException w:name="heading 8" w:uiPriority="9" w:semiHidden="1" w:unhideWhenUsed="1" w:qFormat="1"/>
+    <w:lsdException w:name="heading 9" w:uiPriority="9" w:semiHidden="1" w:unhideWhenUsed="1" w:qFormat="1"/>
     <w:lsdException w:name="index 1" w:semiHidden="1" w:unhideWhenUsed="1"/>
     <w:lsdException w:name="index 2" w:semiHidden="1" w:unhideWhenUsed="1"/>
     <w:lsdException w:name="index 3" w:semiHidden="1" w:unhideWhenUsed="1"/>
@@ -3473,22 +3588,22 @@
     <w:lsdException w:name="index 7" w:semiHidden="1" w:unhideWhenUsed="1"/>
     <w:lsdException w:name="index 8" w:semiHidden="1" w:unhideWhenUsed="1"/>
     <w:lsdException w:name="index 9" w:semiHidden="1" w:unhideWhenUsed="1"/>
-    <w:lsdException w:name="toc 1" w:semiHidden="1" w:uiPriority="39" w:unhideWhenUsed="1"/>
-    <w:lsdException w:name="toc 2" w:semiHidden="1" w:uiPriority="39" w:unhideWhenUsed="1"/>
-    <w:lsdException w:name="toc 3" w:semiHidden="1" w:uiPriority="39" w:unhideWhenUsed="1"/>
-    <w:lsdException w:name="toc 4" w:semiHidden="1" w:uiPriority="39" w:unhideWhenUsed="1"/>
-    <w:lsdException w:name="toc 5" w:semiHidden="1" w:uiPriority="39" w:unhideWhenUsed="1"/>
-    <w:lsdException w:name="toc 6" w:semiHidden="1" w:uiPriority="39" w:unhideWhenUsed="1"/>
-    <w:lsdException w:name="toc 7" w:semiHidden="1" w:uiPriority="39" w:unhideWhenUsed="1"/>
-    <w:lsdException w:name="toc 8" w:semiHidden="1" w:uiPriority="39" w:unhideWhenUsed="1"/>
-    <w:lsdException w:name="toc 9" w:semiHidden="1" w:uiPriority="39" w:unhideWhenUsed="1"/>
+    <w:lsdException w:name="toc 1" w:uiPriority="39" w:semiHidden="1" w:unhideWhenUsed="1"/>
+    <w:lsdException w:name="toc 2" w:uiPriority="39" w:semiHidden="1" w:unhideWhenUsed="1"/>
+    <w:lsdException w:name="toc 3" w:uiPriority="39" w:semiHidden="1" w:unhideWhenUsed="1"/>
+    <w:lsdException w:name="toc 4" w:uiPriority="39" w:semiHidden="1" w:unhideWhenUsed="1"/>
+    <w:lsdException w:name="toc 5" w:uiPriority="39" w:semiHidden="1" w:unhideWhenUsed="1"/>
+    <w:lsdException w:name="toc 6" w:uiPriority="39" w:semiHidden="1" w:unhideWhenUsed="1"/>
+    <w:lsdException w:name="toc 7" w:uiPriority="39" w:semiHidden="1" w:unhideWhenUsed="1"/>
+    <w:lsdException w:name="toc 8" w:uiPriority="39" w:semiHidden="1" w:unhideWhenUsed="1"/>
+    <w:lsdException w:name="toc 9" w:uiPriority="39" w:semiHidden="1" w:unhideWhenUsed="1"/>
     <w:lsdException w:name="Normal Indent" w:semiHidden="1" w:unhideWhenUsed="1"/>
     <w:lsdException w:name="footnote text" w:semiHidden="1" w:unhideWhenUsed="1"/>
     <w:lsdException w:name="annotation text" w:semiHidden="1" w:unhideWhenUsed="1"/>
     <w:lsdException w:name="header" w:semiHidden="1" w:unhideWhenUsed="1"/>
     <w:lsdException w:name="footer" w:semiHidden="1" w:unhideWhenUsed="1"/>
     <w:lsdException w:name="index heading" w:semiHidden="1" w:unhideWhenUsed="1"/>
-    <w:lsdException w:name="caption" w:semiHidden="1" w:uiPriority="35" w:unhideWhenUsed="1" w:qFormat="1"/>
+    <w:lsdException w:name="caption" w:uiPriority="35" w:semiHidden="1" w:unhideWhenUsed="1" w:qFormat="1"/>
     <w:lsdException w:name="table of figures" w:semiHidden="1" w:unhideWhenUsed="1"/>
     <w:lsdException w:name="envelope address" w:semiHidden="1" w:unhideWhenUsed="1"/>
     <w:lsdException w:name="envelope return" w:semiHidden="1" w:unhideWhenUsed="1"/>
@@ -3519,7 +3634,7 @@
     <w:lsdException w:name="Title" w:uiPriority="10" w:qFormat="1"/>
     <w:lsdException w:name="Closing" w:semiHidden="1" w:unhideWhenUsed="1"/>
     <w:lsdException w:name="Signature" w:semiHidden="1" w:unhideWhenUsed="1"/>
-    <w:lsdException w:name="Default Paragraph Font" w:semiHidden="1" w:uiPriority="1" w:unhideWhenUsed="1"/>
+    <w:lsdException w:name="Default Paragraph Font" w:uiPriority="1" w:semiHidden="1" w:unhideWhenUsed="1"/>
     <w:lsdException w:name="Body Text" w:semiHidden="1" w:unhideWhenUsed="1"/>
     <w:lsdException w:name="Body Text Indent" w:semiHidden="1" w:unhideWhenUsed="1"/>
     <w:lsdException w:name="List Continue" w:semiHidden="1" w:unhideWhenUsed="1"/>
@@ -3719,8 +3834,8 @@
     <w:lsdException w:name="Subtle Reference" w:uiPriority="31" w:qFormat="1"/>
     <w:lsdException w:name="Intense Reference" w:uiPriority="32" w:qFormat="1"/>
     <w:lsdException w:name="Book Title" w:uiPriority="33" w:qFormat="1"/>
-    <w:lsdException w:name="Bibliography" w:semiHidden="1" w:uiPriority="37" w:unhideWhenUsed="1"/>
-    <w:lsdException w:name="TOC Heading" w:semiHidden="1" w:uiPriority="39" w:unhideWhenUsed="1" w:qFormat="1"/>
+    <w:lsdException w:name="Bibliography" w:uiPriority="37" w:semiHidden="1" w:unhideWhenUsed="1"/>
+    <w:lsdException w:name="TOC Heading" w:uiPriority="39" w:semiHidden="1" w:unhideWhenUsed="1" w:qFormat="1"/>
     <w:lsdException w:name="Plain Table 1" w:uiPriority="41"/>
     <w:lsdException w:name="Plain Table 2" w:uiPriority="42"/>
     <w:lsdException w:name="Plain Table 3" w:uiPriority="43"/>
@@ -3831,17 +3946,17 @@
     <w:lsdException w:name="Unresolved Mention" w:semiHidden="1" w:unhideWhenUsed="1"/>
     <w:lsdException w:name="Smart Link" w:semiHidden="1" w:unhideWhenUsed="1"/>
   </w:latentStyles>
-  <w:style w:type="paragraph" w:default="1" w:styleId="Normal">
+  <w:style w:type="paragraph" w:styleId="Normal" w:default="1">
     <w:name w:val="Normal"/>
     <w:qFormat/>
   </w:style>
-  <w:style w:type="character" w:default="1" w:styleId="Fuentedeprrafopredeter">
+  <w:style w:type="character" w:styleId="Fuentedeprrafopredeter" w:default="1">
     <w:name w:val="Default Paragraph Font"/>
     <w:uiPriority w:val="1"/>
     <w:semiHidden/>
     <w:unhideWhenUsed/>
   </w:style>
-  <w:style w:type="table" w:default="1" w:styleId="Tablanormal">
+  <w:style w:type="table" w:styleId="Tablanormal" w:default="1">
     <w:name w:val="Normal Table"/>
     <w:uiPriority w:val="99"/>
     <w:semiHidden/>
@@ -3856,13 +3971,13 @@
       </w:tblCellMar>
     </w:tblPr>
   </w:style>
-  <w:style w:type="numbering" w:default="1" w:styleId="Sinlista">
+  <w:style w:type="numbering" w:styleId="Sinlista" w:default="1">
     <w:name w:val="No List"/>
     <w:uiPriority w:val="99"/>
     <w:semiHidden/>
     <w:unhideWhenUsed/>
   </w:style>
-  <w:style w:type="table" w:customStyle="1" w:styleId="TableNormal">
+  <w:style w:type="table" w:styleId="TableNormal" w:customStyle="1">
     <w:name w:val="Table Normal"/>
     <w:uiPriority w:val="99"/>
     <w:semiHidden/>
@@ -3915,12 +4030,12 @@
     </w:pPr>
     <w:tblPr>
       <w:tblBorders>
-        <w:top w:val="single" w:sz="4" w:space="0" w:color="000000" w:themeColor="text1"/>
-        <w:left w:val="single" w:sz="4" w:space="0" w:color="000000" w:themeColor="text1"/>
-        <w:bottom w:val="single" w:sz="4" w:space="0" w:color="000000" w:themeColor="text1"/>
-        <w:right w:val="single" w:sz="4" w:space="0" w:color="000000" w:themeColor="text1"/>
-        <w:insideH w:val="single" w:sz="4" w:space="0" w:color="000000" w:themeColor="text1"/>
-        <w:insideV w:val="single" w:sz="4" w:space="0" w:color="000000" w:themeColor="text1"/>
+        <w:top w:val="single" w:color="000000" w:themeColor="text1" w:sz="4" w:space="0"/>
+        <w:left w:val="single" w:color="000000" w:themeColor="text1" w:sz="4" w:space="0"/>
+        <w:bottom w:val="single" w:color="000000" w:themeColor="text1" w:sz="4" w:space="0"/>
+        <w:right w:val="single" w:color="000000" w:themeColor="text1" w:sz="4" w:space="0"/>
+        <w:insideH w:val="single" w:color="000000" w:themeColor="text1" w:sz="4" w:space="0"/>
+        <w:insideV w:val="single" w:color="000000" w:themeColor="text1" w:sz="4" w:space="0"/>
       </w:tblBorders>
     </w:tblPr>
   </w:style>
@@ -3962,7 +4077,7 @@
 </file>
 
 <file path=word/theme/theme1.xml><?xml version="1.0" encoding="utf-8"?>
-<a:theme xmlns:a="http://schemas.openxmlformats.org/drawingml/2006/main" name="Office Theme">
+<a:theme xmlns:a="http://schemas.openxmlformats.org/drawingml/2006/main" xmlns:thm15="http://schemas.microsoft.com/office/thememl/2012/main" name="Office Theme">
   <a:themeElements>
     <a:clrScheme name="Office">
       <a:dk1>

</xml_diff>